<commit_message>
Add driver, bag fix
Теперь во всех документах есть доп драйверы, но нужно еще починить тему со странами, так же исправил нерабочии ключи
</commit_message>
<xml_diff>
--- a/templates/POA.docx
+++ b/templates/POA.docx
@@ -78,23 +78,7 @@
           <w:sz w:val="20"/>
           <w:lang w:val="ru-RU"/>
         </w:rPr>
-        <w:t xml:space="preserve">ул. </w:t>
-      </w:r>
-      <w:proofErr w:type="spellStart"/>
-      <w:r>
-        <w:rPr>
-          <w:sz w:val="20"/>
-          <w:lang w:val="ru-RU"/>
-        </w:rPr>
-        <w:t>Базарбаева</w:t>
-      </w:r>
-      <w:proofErr w:type="spellEnd"/>
-      <w:r>
-        <w:rPr>
-          <w:sz w:val="20"/>
-          <w:lang w:val="ru-RU"/>
-        </w:rPr>
-        <w:t xml:space="preserve"> 21/12</w:t>
+        <w:t>ул. Базарбаева 21/12</w:t>
       </w:r>
     </w:p>
     <w:p>
@@ -561,7 +545,8 @@
         <w:ind w:left="0" w:firstLine="0"/>
         <w:jc w:val="both"/>
         <w:rPr>
-          <w:rFonts w:cs="Times New Roman"/>
+          <w:rStyle w:val="SourceText"/>
+          <w:rFonts w:ascii="Times New Roman" w:eastAsia="SimSun" w:hAnsi="Times New Roman" w:cs="Times New Roman"/>
           <w:sz w:val="28"/>
           <w:szCs w:val="28"/>
           <w:lang w:val="kk-KZ"/>
@@ -970,19 +955,565 @@
         <w:t>}}</w:t>
       </w:r>
     </w:p>
+    <w:p>
+      <w:pPr>
+        <w:pStyle w:val="af1"/>
+        <w:numPr>
+          <w:ilvl w:val="0"/>
+          <w:numId w:val="1"/>
+        </w:numPr>
+        <w:suppressAutoHyphens w:val="0"/>
+        <w:spacing w:line="240" w:lineRule="auto"/>
+        <w:ind w:left="0" w:firstLine="0"/>
+        <w:jc w:val="both"/>
+        <w:rPr>
+          <w:rFonts w:cs="Times New Roman"/>
+          <w:sz w:val="28"/>
+          <w:szCs w:val="28"/>
+          <w:lang w:val="kk-KZ"/>
+        </w:rPr>
+      </w:pPr>
+      <w:r>
+        <w:rPr>
+          <w:rStyle w:val="StrongEmphasis"/>
+          <w:rFonts w:asciiTheme="minorHAnsi" w:eastAsia="Times New Roman" w:hAnsiTheme="minorHAnsi" w:cstheme="minorHAnsi"/>
+          <w:b w:val="0"/>
+          <w:bCs w:val="0"/>
+          <w:w w:val="80"/>
+          <w:sz w:val="28"/>
+          <w:szCs w:val="28"/>
+          <w:lang w:val="kk-KZ" w:bidi="ar-SA"/>
+        </w:rPr>
+        <w:t>{{DRIVER1_NAME}}</w:t>
+      </w:r>
+      <w:r>
+        <w:rPr>
+          <w:rFonts w:cs="Times New Roman"/>
+          <w:sz w:val="28"/>
+          <w:szCs w:val="28"/>
+          <w:lang w:val="kk-KZ"/>
+        </w:rPr>
+        <w:t>,</w:t>
+      </w:r>
+      <w:r>
+        <w:rPr>
+          <w:rFonts w:cs="Times New Roman"/>
+          <w:sz w:val="28"/>
+          <w:szCs w:val="28"/>
+          <w:lang w:val="kk-KZ"/>
+        </w:rPr>
+        <w:t xml:space="preserve"> паспорт </w:t>
+      </w:r>
+      <w:r>
+        <w:rPr>
+          <w:rFonts w:cs="Times New Roman"/>
+          <w:sz w:val="28"/>
+          <w:szCs w:val="28"/>
+          <w:lang w:val="kk-KZ"/>
+        </w:rPr>
+        <w:t>(удостоверение)</w:t>
+      </w:r>
+      <w:r>
+        <w:rPr>
+          <w:rFonts w:cs="Times New Roman"/>
+          <w:sz w:val="28"/>
+          <w:szCs w:val="28"/>
+          <w:lang w:val="kk-KZ"/>
+        </w:rPr>
+        <w:t xml:space="preserve"> №</w:t>
+      </w:r>
+      <w:r>
+        <w:rPr>
+          <w:rStyle w:val="SourceText"/>
+          <w:rFonts w:asciiTheme="minorHAnsi" w:hAnsiTheme="minorHAnsi" w:cstheme="minorHAnsi"/>
+          <w:w w:val="80"/>
+          <w:sz w:val="28"/>
+          <w:szCs w:val="28"/>
+          <w:lang w:val="kk-KZ" w:bidi="ar-SA"/>
+        </w:rPr>
+        <w:t>{{PASSPORT1_NUMBER}}</w:t>
+      </w:r>
+      <w:r>
+        <w:rPr>
+          <w:rFonts w:cs="Times New Roman"/>
+          <w:sz w:val="28"/>
+          <w:szCs w:val="28"/>
+          <w:lang w:val="kk-KZ"/>
+        </w:rPr>
+        <w:t xml:space="preserve"> от </w:t>
+      </w:r>
+      <w:r>
+        <w:rPr>
+          <w:rStyle w:val="SourceText"/>
+          <w:rFonts w:asciiTheme="minorHAnsi" w:hAnsiTheme="minorHAnsi" w:cstheme="minorHAnsi"/>
+          <w:w w:val="80"/>
+          <w:sz w:val="28"/>
+          <w:szCs w:val="28"/>
+          <w:lang w:val="kk-KZ" w:bidi="ar-SA"/>
+        </w:rPr>
+        <w:t>{{PASSPORT1_ISSUE_DATE}}</w:t>
+      </w:r>
+      <w:r>
+        <w:rPr>
+          <w:rFonts w:cs="Times New Roman"/>
+          <w:sz w:val="28"/>
+          <w:szCs w:val="28"/>
+          <w:lang w:val="kk-KZ"/>
+        </w:rPr>
+        <w:t>, выдан</w:t>
+      </w:r>
+      <w:r>
+        <w:rPr>
+          <w:rFonts w:cs="Times New Roman"/>
+          <w:sz w:val="28"/>
+          <w:szCs w:val="28"/>
+          <w:lang w:val="kk-KZ"/>
+        </w:rPr>
+        <w:t xml:space="preserve">о </w:t>
+      </w:r>
+      <w:r>
+        <w:rPr>
+          <w:rStyle w:val="SourceText"/>
+          <w:rFonts w:asciiTheme="minorHAnsi" w:hAnsiTheme="minorHAnsi" w:cstheme="minorHAnsi"/>
+          <w:w w:val="80"/>
+          <w:sz w:val="28"/>
+          <w:szCs w:val="28"/>
+          <w:lang w:val="kk-KZ" w:bidi="ar-SA"/>
+        </w:rPr>
+        <w:t>{{PASSPORT1_ISSUE_BY}}</w:t>
+      </w:r>
+      <w:r>
+        <w:rPr>
+          <w:rFonts w:cs="Times New Roman"/>
+          <w:sz w:val="28"/>
+          <w:szCs w:val="28"/>
+          <w:lang w:val="kk-KZ"/>
+        </w:rPr>
+        <w:t>; водительские права №</w:t>
+      </w:r>
+      <w:r>
+        <w:rPr>
+          <w:rStyle w:val="SourceText"/>
+          <w:rFonts w:asciiTheme="minorHAnsi" w:hAnsiTheme="minorHAnsi" w:cstheme="minorHAnsi"/>
+          <w:w w:val="80"/>
+          <w:sz w:val="28"/>
+          <w:szCs w:val="28"/>
+          <w:lang w:val="kk-KZ" w:bidi="ar-SA"/>
+        </w:rPr>
+        <w:t>{{DRIVER1_LICENSE}}</w:t>
+      </w:r>
+    </w:p>
     <w:bookmarkEnd w:id="3"/>
     <w:p>
       <w:pPr>
+        <w:pStyle w:val="af1"/>
+        <w:numPr>
+          <w:ilvl w:val="0"/>
+          <w:numId w:val="1"/>
+        </w:numPr>
         <w:suppressAutoHyphens w:val="0"/>
         <w:spacing w:line="240" w:lineRule="auto"/>
+        <w:ind w:left="0" w:firstLine="0"/>
         <w:jc w:val="both"/>
         <w:rPr>
-          <w:rFonts w:cs="Times New Roman"/>
+          <w:rStyle w:val="SourceText"/>
+          <w:rFonts w:ascii="Times New Roman" w:eastAsia="SimSun" w:hAnsi="Times New Roman" w:cs="Times New Roman"/>
           <w:sz w:val="28"/>
           <w:szCs w:val="28"/>
           <w:lang w:val="kk-KZ"/>
         </w:rPr>
       </w:pPr>
+      <w:r>
+        <w:rPr>
+          <w:rStyle w:val="StrongEmphasis"/>
+          <w:rFonts w:asciiTheme="minorHAnsi" w:eastAsia="Times New Roman" w:hAnsiTheme="minorHAnsi" w:cstheme="minorHAnsi"/>
+          <w:b w:val="0"/>
+          <w:bCs w:val="0"/>
+          <w:w w:val="80"/>
+          <w:sz w:val="28"/>
+          <w:szCs w:val="28"/>
+          <w:lang w:val="kk-KZ" w:bidi="ar-SA"/>
+        </w:rPr>
+        <w:t>{{DRIVER2_NAME}}</w:t>
+      </w:r>
+      <w:r>
+        <w:rPr>
+          <w:rFonts w:cs="Times New Roman"/>
+          <w:sz w:val="28"/>
+          <w:szCs w:val="28"/>
+          <w:lang w:val="kk-KZ"/>
+        </w:rPr>
+        <w:t>,</w:t>
+      </w:r>
+      <w:r>
+        <w:rPr>
+          <w:rFonts w:cs="Times New Roman"/>
+          <w:sz w:val="28"/>
+          <w:szCs w:val="28"/>
+          <w:lang w:val="kk-KZ"/>
+        </w:rPr>
+        <w:t xml:space="preserve"> паспорт </w:t>
+      </w:r>
+      <w:r>
+        <w:rPr>
+          <w:rFonts w:cs="Times New Roman"/>
+          <w:sz w:val="28"/>
+          <w:szCs w:val="28"/>
+          <w:lang w:val="kk-KZ"/>
+        </w:rPr>
+        <w:t>(удостоверение)</w:t>
+      </w:r>
+      <w:r>
+        <w:rPr>
+          <w:rFonts w:cs="Times New Roman"/>
+          <w:sz w:val="28"/>
+          <w:szCs w:val="28"/>
+          <w:lang w:val="kk-KZ"/>
+        </w:rPr>
+        <w:t xml:space="preserve"> №</w:t>
+      </w:r>
+      <w:r>
+        <w:rPr>
+          <w:rStyle w:val="SourceText"/>
+          <w:rFonts w:asciiTheme="minorHAnsi" w:hAnsiTheme="minorHAnsi" w:cstheme="minorHAnsi"/>
+          <w:w w:val="80"/>
+          <w:sz w:val="28"/>
+          <w:szCs w:val="28"/>
+          <w:lang w:val="kk-KZ" w:bidi="ar-SA"/>
+        </w:rPr>
+        <w:t>{{PASSPORT2_NUMBER}}</w:t>
+      </w:r>
+      <w:r>
+        <w:rPr>
+          <w:rFonts w:cs="Times New Roman"/>
+          <w:sz w:val="28"/>
+          <w:szCs w:val="28"/>
+          <w:lang w:val="kk-KZ"/>
+        </w:rPr>
+        <w:t xml:space="preserve"> от </w:t>
+      </w:r>
+      <w:r>
+        <w:rPr>
+          <w:rStyle w:val="SourceText"/>
+          <w:rFonts w:asciiTheme="minorHAnsi" w:hAnsiTheme="minorHAnsi" w:cstheme="minorHAnsi"/>
+          <w:w w:val="80"/>
+          <w:sz w:val="28"/>
+          <w:szCs w:val="28"/>
+          <w:lang w:val="kk-KZ" w:bidi="ar-SA"/>
+        </w:rPr>
+        <w:t>{{PASSPORT2_ISSUE_DATE}}</w:t>
+      </w:r>
+      <w:r>
+        <w:rPr>
+          <w:rFonts w:cs="Times New Roman"/>
+          <w:sz w:val="28"/>
+          <w:szCs w:val="28"/>
+          <w:lang w:val="kk-KZ"/>
+        </w:rPr>
+        <w:t>, выдан</w:t>
+      </w:r>
+      <w:r>
+        <w:rPr>
+          <w:rFonts w:cs="Times New Roman"/>
+          <w:sz w:val="28"/>
+          <w:szCs w:val="28"/>
+          <w:lang w:val="kk-KZ"/>
+        </w:rPr>
+        <w:t xml:space="preserve">о </w:t>
+      </w:r>
+      <w:r>
+        <w:rPr>
+          <w:rStyle w:val="SourceText"/>
+          <w:rFonts w:asciiTheme="minorHAnsi" w:hAnsiTheme="minorHAnsi" w:cstheme="minorHAnsi"/>
+          <w:w w:val="80"/>
+          <w:sz w:val="28"/>
+          <w:szCs w:val="28"/>
+          <w:lang w:val="kk-KZ" w:bidi="ar-SA"/>
+        </w:rPr>
+        <w:t>{{PASSPORT2_ISSUE_BY}}</w:t>
+      </w:r>
+      <w:r>
+        <w:rPr>
+          <w:rFonts w:cs="Times New Roman"/>
+          <w:sz w:val="28"/>
+          <w:szCs w:val="28"/>
+          <w:lang w:val="kk-KZ"/>
+        </w:rPr>
+        <w:t>; водительские права №</w:t>
+      </w:r>
+      <w:r>
+        <w:rPr>
+          <w:rStyle w:val="SourceText"/>
+          <w:rFonts w:asciiTheme="minorHAnsi" w:hAnsiTheme="minorHAnsi" w:cstheme="minorHAnsi"/>
+          <w:w w:val="80"/>
+          <w:sz w:val="28"/>
+          <w:szCs w:val="28"/>
+          <w:lang w:val="kk-KZ" w:bidi="ar-SA"/>
+        </w:rPr>
+        <w:t>{{DRIVER2_LICENSE}}</w:t>
+      </w:r>
+    </w:p>
+    <w:p>
+      <w:pPr>
+        <w:pStyle w:val="af1"/>
+        <w:numPr>
+          <w:ilvl w:val="0"/>
+          <w:numId w:val="1"/>
+        </w:numPr>
+        <w:suppressAutoHyphens w:val="0"/>
+        <w:spacing w:line="240" w:lineRule="auto"/>
+        <w:ind w:left="0" w:firstLine="0"/>
+        <w:jc w:val="both"/>
+        <w:rPr>
+          <w:rFonts w:cs="Times New Roman"/>
+          <w:sz w:val="28"/>
+          <w:szCs w:val="28"/>
+          <w:lang w:val="kk-KZ"/>
+        </w:rPr>
+      </w:pPr>
+      <w:r>
+        <w:rPr>
+          <w:rStyle w:val="StrongEmphasis"/>
+          <w:rFonts w:asciiTheme="minorHAnsi" w:eastAsia="Times New Roman" w:hAnsiTheme="minorHAnsi" w:cstheme="minorHAnsi"/>
+          <w:b w:val="0"/>
+          <w:bCs w:val="0"/>
+          <w:w w:val="80"/>
+          <w:sz w:val="28"/>
+          <w:szCs w:val="28"/>
+          <w:lang w:val="kk-KZ" w:bidi="ar-SA"/>
+        </w:rPr>
+        <w:t>{{DRIVER</w:t>
+      </w:r>
+      <w:r>
+        <w:rPr>
+          <w:rStyle w:val="StrongEmphasis"/>
+          <w:rFonts w:asciiTheme="minorHAnsi" w:eastAsia="Times New Roman" w:hAnsiTheme="minorHAnsi" w:cstheme="minorHAnsi"/>
+          <w:b w:val="0"/>
+          <w:bCs w:val="0"/>
+          <w:w w:val="80"/>
+          <w:sz w:val="28"/>
+          <w:szCs w:val="28"/>
+          <w:lang w:val="kk-KZ" w:bidi="ar-SA"/>
+        </w:rPr>
+        <w:t>3</w:t>
+      </w:r>
+      <w:r>
+        <w:rPr>
+          <w:rStyle w:val="StrongEmphasis"/>
+          <w:rFonts w:asciiTheme="minorHAnsi" w:eastAsia="Times New Roman" w:hAnsiTheme="minorHAnsi" w:cstheme="minorHAnsi"/>
+          <w:b w:val="0"/>
+          <w:bCs w:val="0"/>
+          <w:w w:val="80"/>
+          <w:sz w:val="28"/>
+          <w:szCs w:val="28"/>
+          <w:lang w:val="kk-KZ" w:bidi="ar-SA"/>
+        </w:rPr>
+        <w:t>_NAME}}</w:t>
+      </w:r>
+      <w:r>
+        <w:rPr>
+          <w:rFonts w:cs="Times New Roman"/>
+          <w:sz w:val="28"/>
+          <w:szCs w:val="28"/>
+          <w:lang w:val="kk-KZ"/>
+        </w:rPr>
+        <w:t>,</w:t>
+      </w:r>
+      <w:r>
+        <w:rPr>
+          <w:rFonts w:cs="Times New Roman"/>
+          <w:sz w:val="28"/>
+          <w:szCs w:val="28"/>
+          <w:lang w:val="kk-KZ"/>
+        </w:rPr>
+        <w:t xml:space="preserve"> паспорт </w:t>
+      </w:r>
+      <w:r>
+        <w:rPr>
+          <w:rFonts w:cs="Times New Roman"/>
+          <w:sz w:val="28"/>
+          <w:szCs w:val="28"/>
+          <w:lang w:val="kk-KZ"/>
+        </w:rPr>
+        <w:t>(удостоверение)</w:t>
+      </w:r>
+      <w:r>
+        <w:rPr>
+          <w:rFonts w:cs="Times New Roman"/>
+          <w:sz w:val="28"/>
+          <w:szCs w:val="28"/>
+          <w:lang w:val="kk-KZ"/>
+        </w:rPr>
+        <w:t xml:space="preserve"> №</w:t>
+      </w:r>
+      <w:r>
+        <w:rPr>
+          <w:rStyle w:val="SourceText"/>
+          <w:rFonts w:asciiTheme="minorHAnsi" w:hAnsiTheme="minorHAnsi" w:cstheme="minorHAnsi"/>
+          <w:w w:val="80"/>
+          <w:sz w:val="28"/>
+          <w:szCs w:val="28"/>
+          <w:lang w:val="kk-KZ" w:bidi="ar-SA"/>
+        </w:rPr>
+        <w:t>{{PASSPORT</w:t>
+      </w:r>
+      <w:r>
+        <w:rPr>
+          <w:rStyle w:val="SourceText"/>
+          <w:rFonts w:asciiTheme="minorHAnsi" w:hAnsiTheme="minorHAnsi" w:cstheme="minorHAnsi"/>
+          <w:w w:val="80"/>
+          <w:sz w:val="28"/>
+          <w:szCs w:val="28"/>
+          <w:lang w:val="kk-KZ" w:bidi="ar-SA"/>
+        </w:rPr>
+        <w:t>3</w:t>
+      </w:r>
+      <w:r>
+        <w:rPr>
+          <w:rStyle w:val="SourceText"/>
+          <w:rFonts w:asciiTheme="minorHAnsi" w:hAnsiTheme="minorHAnsi" w:cstheme="minorHAnsi"/>
+          <w:w w:val="80"/>
+          <w:sz w:val="28"/>
+          <w:szCs w:val="28"/>
+          <w:lang w:val="kk-KZ" w:bidi="ar-SA"/>
+        </w:rPr>
+        <w:t>_NUMBER}}</w:t>
+      </w:r>
+      <w:r>
+        <w:rPr>
+          <w:rFonts w:cs="Times New Roman"/>
+          <w:sz w:val="28"/>
+          <w:szCs w:val="28"/>
+          <w:lang w:val="kk-KZ"/>
+        </w:rPr>
+        <w:t xml:space="preserve"> от </w:t>
+      </w:r>
+      <w:r>
+        <w:rPr>
+          <w:rStyle w:val="SourceText"/>
+          <w:rFonts w:asciiTheme="minorHAnsi" w:hAnsiTheme="minorHAnsi" w:cstheme="minorHAnsi"/>
+          <w:w w:val="80"/>
+          <w:sz w:val="28"/>
+          <w:szCs w:val="28"/>
+          <w:lang w:val="kk-KZ" w:bidi="ar-SA"/>
+        </w:rPr>
+        <w:t>{{PASSPORT</w:t>
+      </w:r>
+      <w:r>
+        <w:rPr>
+          <w:rStyle w:val="SourceText"/>
+          <w:rFonts w:asciiTheme="minorHAnsi" w:hAnsiTheme="minorHAnsi" w:cstheme="minorHAnsi"/>
+          <w:w w:val="80"/>
+          <w:sz w:val="28"/>
+          <w:szCs w:val="28"/>
+          <w:lang w:val="kk-KZ" w:bidi="ar-SA"/>
+        </w:rPr>
+        <w:t>3</w:t>
+      </w:r>
+      <w:r>
+        <w:rPr>
+          <w:rStyle w:val="SourceText"/>
+          <w:rFonts w:asciiTheme="minorHAnsi" w:hAnsiTheme="minorHAnsi" w:cstheme="minorHAnsi"/>
+          <w:w w:val="80"/>
+          <w:sz w:val="28"/>
+          <w:szCs w:val="28"/>
+          <w:lang w:val="kk-KZ" w:bidi="ar-SA"/>
+        </w:rPr>
+        <w:t>_ISSUE_DATE}}</w:t>
+      </w:r>
+      <w:r>
+        <w:rPr>
+          <w:rFonts w:cs="Times New Roman"/>
+          <w:sz w:val="28"/>
+          <w:szCs w:val="28"/>
+          <w:lang w:val="kk-KZ"/>
+        </w:rPr>
+        <w:t>, выдан</w:t>
+      </w:r>
+      <w:r>
+        <w:rPr>
+          <w:rFonts w:cs="Times New Roman"/>
+          <w:sz w:val="28"/>
+          <w:szCs w:val="28"/>
+          <w:lang w:val="kk-KZ"/>
+        </w:rPr>
+        <w:t xml:space="preserve">о </w:t>
+      </w:r>
+      <w:r>
+        <w:rPr>
+          <w:rStyle w:val="SourceText"/>
+          <w:rFonts w:asciiTheme="minorHAnsi" w:hAnsiTheme="minorHAnsi" w:cstheme="minorHAnsi"/>
+          <w:w w:val="80"/>
+          <w:sz w:val="28"/>
+          <w:szCs w:val="28"/>
+          <w:lang w:val="kk-KZ" w:bidi="ar-SA"/>
+        </w:rPr>
+        <w:t>{{PASSPORT</w:t>
+      </w:r>
+      <w:r>
+        <w:rPr>
+          <w:rStyle w:val="SourceText"/>
+          <w:rFonts w:asciiTheme="minorHAnsi" w:hAnsiTheme="minorHAnsi" w:cstheme="minorHAnsi"/>
+          <w:w w:val="80"/>
+          <w:sz w:val="28"/>
+          <w:szCs w:val="28"/>
+          <w:lang w:val="kk-KZ" w:bidi="ar-SA"/>
+        </w:rPr>
+        <w:t>3</w:t>
+      </w:r>
+      <w:r>
+        <w:rPr>
+          <w:rStyle w:val="SourceText"/>
+          <w:rFonts w:asciiTheme="minorHAnsi" w:hAnsiTheme="minorHAnsi" w:cstheme="minorHAnsi"/>
+          <w:w w:val="80"/>
+          <w:sz w:val="28"/>
+          <w:szCs w:val="28"/>
+          <w:lang w:val="kk-KZ" w:bidi="ar-SA"/>
+        </w:rPr>
+        <w:t>_ISSUE_BY}}</w:t>
+      </w:r>
+      <w:r>
+        <w:rPr>
+          <w:rFonts w:cs="Times New Roman"/>
+          <w:sz w:val="28"/>
+          <w:szCs w:val="28"/>
+          <w:lang w:val="kk-KZ"/>
+        </w:rPr>
+        <w:t>; водительские права №</w:t>
+      </w:r>
+      <w:r>
+        <w:rPr>
+          <w:rStyle w:val="SourceText"/>
+          <w:rFonts w:asciiTheme="minorHAnsi" w:hAnsiTheme="minorHAnsi" w:cstheme="minorHAnsi"/>
+          <w:w w:val="80"/>
+          <w:sz w:val="28"/>
+          <w:szCs w:val="28"/>
+          <w:lang w:val="kk-KZ" w:bidi="ar-SA"/>
+        </w:rPr>
+        <w:t>{{DRIVER</w:t>
+      </w:r>
+      <w:r>
+        <w:rPr>
+          <w:rStyle w:val="SourceText"/>
+          <w:rFonts w:asciiTheme="minorHAnsi" w:hAnsiTheme="minorHAnsi" w:cstheme="minorHAnsi"/>
+          <w:w w:val="80"/>
+          <w:sz w:val="28"/>
+          <w:szCs w:val="28"/>
+          <w:lang w:val="kk-KZ" w:bidi="ar-SA"/>
+        </w:rPr>
+        <w:t>3</w:t>
+      </w:r>
+      <w:r>
+        <w:rPr>
+          <w:rStyle w:val="SourceText"/>
+          <w:rFonts w:asciiTheme="minorHAnsi" w:hAnsiTheme="minorHAnsi" w:cstheme="minorHAnsi"/>
+          <w:w w:val="80"/>
+          <w:sz w:val="28"/>
+          <w:szCs w:val="28"/>
+          <w:lang w:val="kk-KZ" w:bidi="ar-SA"/>
+        </w:rPr>
+        <w:t>_LICENSE}}</w:t>
+      </w:r>
     </w:p>
     <w:p>
       <w:pPr>
@@ -1464,7 +1995,6 @@
         </w:rPr>
         <w:t xml:space="preserve"> </w:t>
       </w:r>
-      <w:proofErr w:type="gramStart"/>
       <w:r>
         <w:t>Venture</w:t>
       </w:r>
@@ -1472,14 +2002,7 @@
         <w:rPr>
           <w:lang w:val="ru-RU"/>
         </w:rPr>
-        <w:t xml:space="preserve">»   </w:t>
-      </w:r>
-      <w:proofErr w:type="gramEnd"/>
-      <w:r>
-        <w:rPr>
-          <w:lang w:val="ru-RU"/>
-        </w:rPr>
-        <w:t>________________________________Касымов Т.Ш.</w:t>
+        <w:t>»   ________________________________Касымов Т.Ш.</w:t>
       </w:r>
     </w:p>
     <w:sectPr>

</xml_diff>

<commit_message>
MOREBAGS and old bag fix
Много чего поменял, но новые баги вылазиют, надо чинить, следующим пушем загружу текствоый документ пронта для чата гпт.
</commit_message>
<xml_diff>
--- a/templates/POA.docx
+++ b/templates/POA.docx
@@ -968,11 +968,11 @@
         <w:jc w:val="both"/>
         <w:rPr>
           <w:rFonts w:cs="Times New Roman"/>
-          <w:sz w:val="28"/>
-          <w:szCs w:val="28"/>
           <w:lang w:val="kk-KZ"/>
         </w:rPr>
       </w:pPr>
+      <w:bookmarkStart w:id="4" w:name="_Hlk213105182"/>
+      <w:bookmarkEnd w:id="3"/>
       <w:r>
         <w:rPr>
           <w:rStyle w:val="StrongEmphasis"/>
@@ -980,130 +980,33 @@
           <w:b w:val="0"/>
           <w:bCs w:val="0"/>
           <w:w w:val="80"/>
-          <w:sz w:val="28"/>
-          <w:szCs w:val="28"/>
           <w:lang w:val="kk-KZ" w:bidi="ar-SA"/>
         </w:rPr>
-        <w:t>{{DRIVER1_NAME}}</w:t>
-      </w:r>
-      <w:r>
-        <w:rPr>
-          <w:rFonts w:cs="Times New Roman"/>
-          <w:sz w:val="28"/>
-          <w:szCs w:val="28"/>
-          <w:lang w:val="kk-KZ"/>
-        </w:rPr>
-        <w:t>,</w:t>
-      </w:r>
-      <w:r>
-        <w:rPr>
-          <w:rFonts w:cs="Times New Roman"/>
-          <w:sz w:val="28"/>
-          <w:szCs w:val="28"/>
-          <w:lang w:val="kk-KZ"/>
-        </w:rPr>
-        <w:t xml:space="preserve"> паспорт </w:t>
-      </w:r>
-      <w:r>
-        <w:rPr>
-          <w:rFonts w:cs="Times New Roman"/>
-          <w:sz w:val="28"/>
-          <w:szCs w:val="28"/>
-          <w:lang w:val="kk-KZ"/>
-        </w:rPr>
-        <w:t>(удостоверение)</w:t>
-      </w:r>
-      <w:r>
-        <w:rPr>
-          <w:rFonts w:cs="Times New Roman"/>
-          <w:sz w:val="28"/>
-          <w:szCs w:val="28"/>
-          <w:lang w:val="kk-KZ"/>
-        </w:rPr>
-        <w:t xml:space="preserve"> №</w:t>
-      </w:r>
-      <w:r>
-        <w:rPr>
-          <w:rStyle w:val="SourceText"/>
-          <w:rFonts w:asciiTheme="minorHAnsi" w:hAnsiTheme="minorHAnsi" w:cstheme="minorHAnsi"/>
-          <w:w w:val="80"/>
-          <w:sz w:val="28"/>
-          <w:szCs w:val="28"/>
+        <w:t>{{DRIVER1_</w:t>
+      </w:r>
+      <w:r>
+        <w:rPr>
+          <w:rStyle w:val="StrongEmphasis"/>
+          <w:rFonts w:asciiTheme="minorHAnsi" w:eastAsia="Times New Roman" w:hAnsiTheme="minorHAnsi" w:cstheme="minorHAnsi"/>
+          <w:b w:val="0"/>
+          <w:bCs w:val="0"/>
+          <w:w w:val="80"/>
+          <w:lang w:bidi="ar-SA"/>
+        </w:rPr>
+        <w:t>BLOCK</w:t>
+      </w:r>
+      <w:r>
+        <w:rPr>
+          <w:rStyle w:val="StrongEmphasis"/>
+          <w:rFonts w:asciiTheme="minorHAnsi" w:eastAsia="Times New Roman" w:hAnsiTheme="minorHAnsi" w:cstheme="minorHAnsi"/>
+          <w:b w:val="0"/>
+          <w:bCs w:val="0"/>
+          <w:w w:val="80"/>
           <w:lang w:val="kk-KZ" w:bidi="ar-SA"/>
         </w:rPr>
-        <w:t>{{PASSPORT1_NUMBER}}</w:t>
-      </w:r>
-      <w:r>
-        <w:rPr>
-          <w:rFonts w:cs="Times New Roman"/>
-          <w:sz w:val="28"/>
-          <w:szCs w:val="28"/>
-          <w:lang w:val="kk-KZ"/>
-        </w:rPr>
-        <w:t xml:space="preserve"> от </w:t>
-      </w:r>
-      <w:r>
-        <w:rPr>
-          <w:rStyle w:val="SourceText"/>
-          <w:rFonts w:asciiTheme="minorHAnsi" w:hAnsiTheme="minorHAnsi" w:cstheme="minorHAnsi"/>
-          <w:w w:val="80"/>
-          <w:sz w:val="28"/>
-          <w:szCs w:val="28"/>
-          <w:lang w:val="kk-KZ" w:bidi="ar-SA"/>
-        </w:rPr>
-        <w:t>{{PASSPORT1_ISSUE_DATE}}</w:t>
-      </w:r>
-      <w:r>
-        <w:rPr>
-          <w:rFonts w:cs="Times New Roman"/>
-          <w:sz w:val="28"/>
-          <w:szCs w:val="28"/>
-          <w:lang w:val="kk-KZ"/>
-        </w:rPr>
-        <w:t>, выдан</w:t>
-      </w:r>
-      <w:r>
-        <w:rPr>
-          <w:rFonts w:cs="Times New Roman"/>
-          <w:sz w:val="28"/>
-          <w:szCs w:val="28"/>
-          <w:lang w:val="kk-KZ"/>
-        </w:rPr>
-        <w:t xml:space="preserve">о </w:t>
-      </w:r>
-      <w:r>
-        <w:rPr>
-          <w:rStyle w:val="SourceText"/>
-          <w:rFonts w:asciiTheme="minorHAnsi" w:hAnsiTheme="minorHAnsi" w:cstheme="minorHAnsi"/>
-          <w:w w:val="80"/>
-          <w:sz w:val="28"/>
-          <w:szCs w:val="28"/>
-          <w:lang w:val="kk-KZ" w:bidi="ar-SA"/>
-        </w:rPr>
-        <w:t>{{PASSPORT1_ISSUE_BY}}</w:t>
-      </w:r>
-      <w:r>
-        <w:rPr>
-          <w:rFonts w:cs="Times New Roman"/>
-          <w:sz w:val="28"/>
-          <w:szCs w:val="28"/>
-          <w:lang w:val="kk-KZ"/>
-        </w:rPr>
-        <w:t>; водительские права №</w:t>
-      </w:r>
-      <w:r>
-        <w:rPr>
-          <w:rStyle w:val="SourceText"/>
-          <w:rFonts w:asciiTheme="minorHAnsi" w:hAnsiTheme="minorHAnsi" w:cstheme="minorHAnsi"/>
-          <w:w w:val="80"/>
-          <w:sz w:val="28"/>
-          <w:szCs w:val="28"/>
-          <w:lang w:val="kk-KZ" w:bidi="ar-SA"/>
-        </w:rPr>
-        <w:t>{{DRIVER1_LICENSE}}</w:t>
+        <w:t>}}</w:t>
       </w:r>
     </w:p>
-    <w:bookmarkEnd w:id="3"/>
     <w:p>
       <w:pPr>
         <w:pStyle w:val="af1"/>
@@ -1118,8 +1021,6 @@
         <w:rPr>
           <w:rStyle w:val="SourceText"/>
           <w:rFonts w:ascii="Times New Roman" w:eastAsia="SimSun" w:hAnsi="Times New Roman" w:cs="Times New Roman"/>
-          <w:sz w:val="28"/>
-          <w:szCs w:val="28"/>
           <w:lang w:val="kk-KZ"/>
         </w:rPr>
       </w:pPr>
@@ -1130,127 +1031,31 @@
           <w:b w:val="0"/>
           <w:bCs w:val="0"/>
           <w:w w:val="80"/>
-          <w:sz w:val="28"/>
-          <w:szCs w:val="28"/>
           <w:lang w:val="kk-KZ" w:bidi="ar-SA"/>
         </w:rPr>
-        <w:t>{{DRIVER2_NAME}}</w:t>
-      </w:r>
-      <w:r>
-        <w:rPr>
-          <w:rFonts w:cs="Times New Roman"/>
-          <w:sz w:val="28"/>
-          <w:szCs w:val="28"/>
-          <w:lang w:val="kk-KZ"/>
-        </w:rPr>
-        <w:t>,</w:t>
-      </w:r>
-      <w:r>
-        <w:rPr>
-          <w:rFonts w:cs="Times New Roman"/>
-          <w:sz w:val="28"/>
-          <w:szCs w:val="28"/>
-          <w:lang w:val="kk-KZ"/>
-        </w:rPr>
-        <w:t xml:space="preserve"> паспорт </w:t>
-      </w:r>
-      <w:r>
-        <w:rPr>
-          <w:rFonts w:cs="Times New Roman"/>
-          <w:sz w:val="28"/>
-          <w:szCs w:val="28"/>
-          <w:lang w:val="kk-KZ"/>
-        </w:rPr>
-        <w:t>(удостоверение)</w:t>
-      </w:r>
-      <w:r>
-        <w:rPr>
-          <w:rFonts w:cs="Times New Roman"/>
-          <w:sz w:val="28"/>
-          <w:szCs w:val="28"/>
-          <w:lang w:val="kk-KZ"/>
-        </w:rPr>
-        <w:t xml:space="preserve"> №</w:t>
-      </w:r>
-      <w:r>
-        <w:rPr>
-          <w:rStyle w:val="SourceText"/>
-          <w:rFonts w:asciiTheme="minorHAnsi" w:hAnsiTheme="minorHAnsi" w:cstheme="minorHAnsi"/>
-          <w:w w:val="80"/>
-          <w:sz w:val="28"/>
-          <w:szCs w:val="28"/>
+        <w:t>{{DRIVER2_</w:t>
+      </w:r>
+      <w:r>
+        <w:rPr>
+          <w:rStyle w:val="StrongEmphasis"/>
+          <w:rFonts w:asciiTheme="minorHAnsi" w:eastAsia="Times New Roman" w:hAnsiTheme="minorHAnsi" w:cstheme="minorHAnsi"/>
+          <w:b w:val="0"/>
+          <w:bCs w:val="0"/>
+          <w:w w:val="80"/>
+          <w:lang w:bidi="ar-SA"/>
+        </w:rPr>
+        <w:t>BLOCK</w:t>
+      </w:r>
+      <w:r>
+        <w:rPr>
+          <w:rStyle w:val="StrongEmphasis"/>
+          <w:rFonts w:asciiTheme="minorHAnsi" w:eastAsia="Times New Roman" w:hAnsiTheme="minorHAnsi" w:cstheme="minorHAnsi"/>
+          <w:b w:val="0"/>
+          <w:bCs w:val="0"/>
+          <w:w w:val="80"/>
           <w:lang w:val="kk-KZ" w:bidi="ar-SA"/>
         </w:rPr>
-        <w:t>{{PASSPORT2_NUMBER}}</w:t>
-      </w:r>
-      <w:r>
-        <w:rPr>
-          <w:rFonts w:cs="Times New Roman"/>
-          <w:sz w:val="28"/>
-          <w:szCs w:val="28"/>
-          <w:lang w:val="kk-KZ"/>
-        </w:rPr>
-        <w:t xml:space="preserve"> от </w:t>
-      </w:r>
-      <w:r>
-        <w:rPr>
-          <w:rStyle w:val="SourceText"/>
-          <w:rFonts w:asciiTheme="minorHAnsi" w:hAnsiTheme="minorHAnsi" w:cstheme="minorHAnsi"/>
-          <w:w w:val="80"/>
-          <w:sz w:val="28"/>
-          <w:szCs w:val="28"/>
-          <w:lang w:val="kk-KZ" w:bidi="ar-SA"/>
-        </w:rPr>
-        <w:t>{{PASSPORT2_ISSUE_DATE}}</w:t>
-      </w:r>
-      <w:r>
-        <w:rPr>
-          <w:rFonts w:cs="Times New Roman"/>
-          <w:sz w:val="28"/>
-          <w:szCs w:val="28"/>
-          <w:lang w:val="kk-KZ"/>
-        </w:rPr>
-        <w:t>, выдан</w:t>
-      </w:r>
-      <w:r>
-        <w:rPr>
-          <w:rFonts w:cs="Times New Roman"/>
-          <w:sz w:val="28"/>
-          <w:szCs w:val="28"/>
-          <w:lang w:val="kk-KZ"/>
-        </w:rPr>
-        <w:t xml:space="preserve">о </w:t>
-      </w:r>
-      <w:r>
-        <w:rPr>
-          <w:rStyle w:val="SourceText"/>
-          <w:rFonts w:asciiTheme="minorHAnsi" w:hAnsiTheme="minorHAnsi" w:cstheme="minorHAnsi"/>
-          <w:w w:val="80"/>
-          <w:sz w:val="28"/>
-          <w:szCs w:val="28"/>
-          <w:lang w:val="kk-KZ" w:bidi="ar-SA"/>
-        </w:rPr>
-        <w:t>{{PASSPORT2_ISSUE_BY}}</w:t>
-      </w:r>
-      <w:r>
-        <w:rPr>
-          <w:rFonts w:cs="Times New Roman"/>
-          <w:sz w:val="28"/>
-          <w:szCs w:val="28"/>
-          <w:lang w:val="kk-KZ"/>
-        </w:rPr>
-        <w:t>; водительские права №</w:t>
-      </w:r>
-      <w:r>
-        <w:rPr>
-          <w:rStyle w:val="SourceText"/>
-          <w:rFonts w:asciiTheme="minorHAnsi" w:hAnsiTheme="minorHAnsi" w:cstheme="minorHAnsi"/>
-          <w:w w:val="80"/>
-          <w:sz w:val="28"/>
-          <w:szCs w:val="28"/>
-          <w:lang w:val="kk-KZ" w:bidi="ar-SA"/>
-        </w:rPr>
-        <w:t>{{DRIVER2_LICENSE}}</w:t>
+        <w:t>}}</w:t>
       </w:r>
     </w:p>
     <w:p>
@@ -1265,9 +1070,8 @@
         <w:ind w:left="0" w:firstLine="0"/>
         <w:jc w:val="both"/>
         <w:rPr>
-          <w:rFonts w:cs="Times New Roman"/>
-          <w:sz w:val="28"/>
-          <w:szCs w:val="28"/>
+          <w:rStyle w:val="SourceText"/>
+          <w:rFonts w:ascii="Times New Roman" w:eastAsia="SimSun" w:hAnsi="Times New Roman" w:cs="Times New Roman"/>
           <w:lang w:val="kk-KZ"/>
         </w:rPr>
       </w:pPr>
@@ -1278,11 +1082,9 @@
           <w:b w:val="0"/>
           <w:bCs w:val="0"/>
           <w:w w:val="80"/>
-          <w:sz w:val="28"/>
-          <w:szCs w:val="28"/>
           <w:lang w:val="kk-KZ" w:bidi="ar-SA"/>
         </w:rPr>
-        <w:t>{{DRIVER</w:t>
+        <w:t>{{DRIVER3_</w:t>
       </w:r>
       <w:r>
         <w:rPr>
@@ -1291,11 +1093,9 @@
           <w:b w:val="0"/>
           <w:bCs w:val="0"/>
           <w:w w:val="80"/>
-          <w:sz w:val="28"/>
-          <w:szCs w:val="28"/>
-          <w:lang w:val="kk-KZ" w:bidi="ar-SA"/>
-        </w:rPr>
-        <w:t>3</w:t>
+          <w:lang w:bidi="ar-SA"/>
+        </w:rPr>
+        <w:t>BLOCK</w:t>
       </w:r>
       <w:r>
         <w:rPr>
@@ -1304,215 +1104,9 @@
           <w:b w:val="0"/>
           <w:bCs w:val="0"/>
           <w:w w:val="80"/>
-          <w:sz w:val="28"/>
-          <w:szCs w:val="28"/>
           <w:lang w:val="kk-KZ" w:bidi="ar-SA"/>
         </w:rPr>
-        <w:t>_NAME}}</w:t>
-      </w:r>
-      <w:r>
-        <w:rPr>
-          <w:rFonts w:cs="Times New Roman"/>
-          <w:sz w:val="28"/>
-          <w:szCs w:val="28"/>
-          <w:lang w:val="kk-KZ"/>
-        </w:rPr>
-        <w:t>,</w:t>
-      </w:r>
-      <w:r>
-        <w:rPr>
-          <w:rFonts w:cs="Times New Roman"/>
-          <w:sz w:val="28"/>
-          <w:szCs w:val="28"/>
-          <w:lang w:val="kk-KZ"/>
-        </w:rPr>
-        <w:t xml:space="preserve"> паспорт </w:t>
-      </w:r>
-      <w:r>
-        <w:rPr>
-          <w:rFonts w:cs="Times New Roman"/>
-          <w:sz w:val="28"/>
-          <w:szCs w:val="28"/>
-          <w:lang w:val="kk-KZ"/>
-        </w:rPr>
-        <w:t>(удостоверение)</w:t>
-      </w:r>
-      <w:r>
-        <w:rPr>
-          <w:rFonts w:cs="Times New Roman"/>
-          <w:sz w:val="28"/>
-          <w:szCs w:val="28"/>
-          <w:lang w:val="kk-KZ"/>
-        </w:rPr>
-        <w:t xml:space="preserve"> №</w:t>
-      </w:r>
-      <w:r>
-        <w:rPr>
-          <w:rStyle w:val="SourceText"/>
-          <w:rFonts w:asciiTheme="minorHAnsi" w:hAnsiTheme="minorHAnsi" w:cstheme="minorHAnsi"/>
-          <w:w w:val="80"/>
-          <w:sz w:val="28"/>
-          <w:szCs w:val="28"/>
-          <w:lang w:val="kk-KZ" w:bidi="ar-SA"/>
-        </w:rPr>
-        <w:t>{{PASSPORT</w:t>
-      </w:r>
-      <w:r>
-        <w:rPr>
-          <w:rStyle w:val="SourceText"/>
-          <w:rFonts w:asciiTheme="minorHAnsi" w:hAnsiTheme="minorHAnsi" w:cstheme="minorHAnsi"/>
-          <w:w w:val="80"/>
-          <w:sz w:val="28"/>
-          <w:szCs w:val="28"/>
-          <w:lang w:val="kk-KZ" w:bidi="ar-SA"/>
-        </w:rPr>
-        <w:t>3</w:t>
-      </w:r>
-      <w:r>
-        <w:rPr>
-          <w:rStyle w:val="SourceText"/>
-          <w:rFonts w:asciiTheme="minorHAnsi" w:hAnsiTheme="minorHAnsi" w:cstheme="minorHAnsi"/>
-          <w:w w:val="80"/>
-          <w:sz w:val="28"/>
-          <w:szCs w:val="28"/>
-          <w:lang w:val="kk-KZ" w:bidi="ar-SA"/>
-        </w:rPr>
-        <w:t>_NUMBER}}</w:t>
-      </w:r>
-      <w:r>
-        <w:rPr>
-          <w:rFonts w:cs="Times New Roman"/>
-          <w:sz w:val="28"/>
-          <w:szCs w:val="28"/>
-          <w:lang w:val="kk-KZ"/>
-        </w:rPr>
-        <w:t xml:space="preserve"> от </w:t>
-      </w:r>
-      <w:r>
-        <w:rPr>
-          <w:rStyle w:val="SourceText"/>
-          <w:rFonts w:asciiTheme="minorHAnsi" w:hAnsiTheme="minorHAnsi" w:cstheme="minorHAnsi"/>
-          <w:w w:val="80"/>
-          <w:sz w:val="28"/>
-          <w:szCs w:val="28"/>
-          <w:lang w:val="kk-KZ" w:bidi="ar-SA"/>
-        </w:rPr>
-        <w:t>{{PASSPORT</w:t>
-      </w:r>
-      <w:r>
-        <w:rPr>
-          <w:rStyle w:val="SourceText"/>
-          <w:rFonts w:asciiTheme="minorHAnsi" w:hAnsiTheme="minorHAnsi" w:cstheme="minorHAnsi"/>
-          <w:w w:val="80"/>
-          <w:sz w:val="28"/>
-          <w:szCs w:val="28"/>
-          <w:lang w:val="kk-KZ" w:bidi="ar-SA"/>
-        </w:rPr>
-        <w:t>3</w:t>
-      </w:r>
-      <w:r>
-        <w:rPr>
-          <w:rStyle w:val="SourceText"/>
-          <w:rFonts w:asciiTheme="minorHAnsi" w:hAnsiTheme="minorHAnsi" w:cstheme="minorHAnsi"/>
-          <w:w w:val="80"/>
-          <w:sz w:val="28"/>
-          <w:szCs w:val="28"/>
-          <w:lang w:val="kk-KZ" w:bidi="ar-SA"/>
-        </w:rPr>
-        <w:t>_ISSUE_DATE}}</w:t>
-      </w:r>
-      <w:r>
-        <w:rPr>
-          <w:rFonts w:cs="Times New Roman"/>
-          <w:sz w:val="28"/>
-          <w:szCs w:val="28"/>
-          <w:lang w:val="kk-KZ"/>
-        </w:rPr>
-        <w:t>, выдан</w:t>
-      </w:r>
-      <w:r>
-        <w:rPr>
-          <w:rFonts w:cs="Times New Roman"/>
-          <w:sz w:val="28"/>
-          <w:szCs w:val="28"/>
-          <w:lang w:val="kk-KZ"/>
-        </w:rPr>
-        <w:t xml:space="preserve">о </w:t>
-      </w:r>
-      <w:r>
-        <w:rPr>
-          <w:rStyle w:val="SourceText"/>
-          <w:rFonts w:asciiTheme="minorHAnsi" w:hAnsiTheme="minorHAnsi" w:cstheme="minorHAnsi"/>
-          <w:w w:val="80"/>
-          <w:sz w:val="28"/>
-          <w:szCs w:val="28"/>
-          <w:lang w:val="kk-KZ" w:bidi="ar-SA"/>
-        </w:rPr>
-        <w:t>{{PASSPORT</w:t>
-      </w:r>
-      <w:r>
-        <w:rPr>
-          <w:rStyle w:val="SourceText"/>
-          <w:rFonts w:asciiTheme="minorHAnsi" w:hAnsiTheme="minorHAnsi" w:cstheme="minorHAnsi"/>
-          <w:w w:val="80"/>
-          <w:sz w:val="28"/>
-          <w:szCs w:val="28"/>
-          <w:lang w:val="kk-KZ" w:bidi="ar-SA"/>
-        </w:rPr>
-        <w:t>3</w:t>
-      </w:r>
-      <w:r>
-        <w:rPr>
-          <w:rStyle w:val="SourceText"/>
-          <w:rFonts w:asciiTheme="minorHAnsi" w:hAnsiTheme="minorHAnsi" w:cstheme="minorHAnsi"/>
-          <w:w w:val="80"/>
-          <w:sz w:val="28"/>
-          <w:szCs w:val="28"/>
-          <w:lang w:val="kk-KZ" w:bidi="ar-SA"/>
-        </w:rPr>
-        <w:t>_ISSUE_BY}}</w:t>
-      </w:r>
-      <w:r>
-        <w:rPr>
-          <w:rFonts w:cs="Times New Roman"/>
-          <w:sz w:val="28"/>
-          <w:szCs w:val="28"/>
-          <w:lang w:val="kk-KZ"/>
-        </w:rPr>
-        <w:t>; водительские права №</w:t>
-      </w:r>
-      <w:r>
-        <w:rPr>
-          <w:rStyle w:val="SourceText"/>
-          <w:rFonts w:asciiTheme="minorHAnsi" w:hAnsiTheme="minorHAnsi" w:cstheme="minorHAnsi"/>
-          <w:w w:val="80"/>
-          <w:sz w:val="28"/>
-          <w:szCs w:val="28"/>
-          <w:lang w:val="kk-KZ" w:bidi="ar-SA"/>
-        </w:rPr>
-        <w:t>{{DRIVER</w:t>
-      </w:r>
-      <w:r>
-        <w:rPr>
-          <w:rStyle w:val="SourceText"/>
-          <w:rFonts w:asciiTheme="minorHAnsi" w:hAnsiTheme="minorHAnsi" w:cstheme="minorHAnsi"/>
-          <w:w w:val="80"/>
-          <w:sz w:val="28"/>
-          <w:szCs w:val="28"/>
-          <w:lang w:val="kk-KZ" w:bidi="ar-SA"/>
-        </w:rPr>
-        <w:t>3</w:t>
-      </w:r>
-      <w:r>
-        <w:rPr>
-          <w:rStyle w:val="SourceText"/>
-          <w:rFonts w:asciiTheme="minorHAnsi" w:hAnsiTheme="minorHAnsi" w:cstheme="minorHAnsi"/>
-          <w:w w:val="80"/>
-          <w:sz w:val="28"/>
-          <w:szCs w:val="28"/>
-          <w:lang w:val="kk-KZ" w:bidi="ar-SA"/>
-        </w:rPr>
-        <w:t>_LICENSE}}</w:t>
+        <w:t>}}</w:t>
       </w:r>
     </w:p>
     <w:p>
@@ -1522,7 +1116,6 @@
           <w:lang w:val="ru-RU"/>
         </w:rPr>
       </w:pPr>
-      <w:bookmarkStart w:id="4" w:name="_Hlk213105182"/>
       <w:r>
         <w:rPr>
           <w:rFonts w:cs="Times New Roman"/>
@@ -1895,8 +1488,9 @@
           <w:szCs w:val="28"/>
           <w:lang w:val="ru-RU"/>
         </w:rPr>
-        <w:t xml:space="preserve">года по всей территории Казахстана и за ее пределами </w:t>
-      </w:r>
+        <w:t xml:space="preserve">года по всей территории Казахстана </w:t>
+      </w:r>
+      <w:bookmarkStart w:id="5" w:name="_Hlk218504494"/>
       <w:r>
         <w:rPr>
           <w:rStyle w:val="SourceText"/>
@@ -1917,7 +1511,7 @@
           <w:szCs w:val="28"/>
           <w:lang w:bidi="ar-SA"/>
         </w:rPr>
-        <w:t>ALLOWED</w:t>
+        <w:t>OUTSIDE</w:t>
       </w:r>
       <w:r>
         <w:rPr>
@@ -1939,7 +1533,29 @@
           <w:szCs w:val="28"/>
           <w:lang w:bidi="ar-SA"/>
         </w:rPr>
-        <w:t>TERRITORIES</w:t>
+        <w:t>KZ</w:t>
+      </w:r>
+      <w:r>
+        <w:rPr>
+          <w:rStyle w:val="SourceText"/>
+          <w:rFonts w:asciiTheme="minorHAnsi" w:hAnsiTheme="minorHAnsi" w:cstheme="minorHAnsi"/>
+          <w:w w:val="80"/>
+          <w:sz w:val="28"/>
+          <w:szCs w:val="28"/>
+          <w:lang w:val="ru-RU" w:bidi="ar-SA"/>
+        </w:rPr>
+        <w:t>_</w:t>
+      </w:r>
+      <w:r>
+        <w:rPr>
+          <w:rStyle w:val="SourceText"/>
+          <w:rFonts w:asciiTheme="minorHAnsi" w:hAnsiTheme="minorHAnsi" w:cstheme="minorHAnsi"/>
+          <w:w w:val="80"/>
+          <w:sz w:val="28"/>
+          <w:szCs w:val="28"/>
+          <w:lang w:bidi="ar-SA"/>
+        </w:rPr>
+        <w:t>BLOCK</w:t>
       </w:r>
       <w:r>
         <w:rPr>
@@ -1952,6 +1568,7 @@
         </w:rPr>
         <w:t>}}</w:t>
       </w:r>
+      <w:bookmarkEnd w:id="5"/>
       <w:r>
         <w:rPr>
           <w:rFonts w:cs="Times New Roman"/>

</xml_diff>